<commit_message>
updated project report files
</commit_message>
<xml_diff>
--- a/complaint-processor/docs/Project_Report.docx
+++ b/complaint-processor/docs/Project_Report.docx
@@ -192,7 +192,19 @@
         <w:t>Date:</w:t>
       </w:r>
       <w:r>
-        <w:t xml:space="preserve"> 15th September 2026</w:t>
+        <w:t xml:space="preserve"> 15</w:t>
+      </w:r>
+      <w:r>
+        <w:rPr>
+          <w:vertAlign w:val="superscript"/>
+        </w:rPr>
+        <w:t>th</w:t>
+      </w:r>
+      <w:r>
+        <w:t xml:space="preserve"> </w:t>
+      </w:r>
+      <w:r>
+        <w:t>September 2026</w:t>
       </w:r>
     </w:p>
     <w:p>
@@ -237,12 +249,6 @@
         <w:gridCol w:w="800"/>
       </w:tblGrid>
       <w:tr>
-        <w:tblPrEx>
-          <w:tblCellMar>
-            <w:top w:w="0" w:type="dxa"/>
-            <w:bottom w:w="0" w:type="dxa"/>
-          </w:tblCellMar>
-        </w:tblPrEx>
         <w:tc>
           <w:tcPr>
             <w:tcW w:w="8226" w:type="dxa"/>
@@ -284,12 +290,6 @@
         </w:tc>
       </w:tr>
       <w:tr>
-        <w:tblPrEx>
-          <w:tblCellMar>
-            <w:top w:w="0" w:type="dxa"/>
-            <w:bottom w:w="0" w:type="dxa"/>
-          </w:tblCellMar>
-        </w:tblPrEx>
         <w:tc>
           <w:tcPr>
             <w:tcW w:w="8226" w:type="dxa"/>
@@ -331,12 +331,6 @@
         </w:tc>
       </w:tr>
       <w:tr>
-        <w:tblPrEx>
-          <w:tblCellMar>
-            <w:top w:w="0" w:type="dxa"/>
-            <w:bottom w:w="0" w:type="dxa"/>
-          </w:tblCellMar>
-        </w:tblPrEx>
         <w:tc>
           <w:tcPr>
             <w:tcW w:w="8226" w:type="dxa"/>
@@ -378,12 +372,6 @@
         </w:tc>
       </w:tr>
       <w:tr>
-        <w:tblPrEx>
-          <w:tblCellMar>
-            <w:top w:w="0" w:type="dxa"/>
-            <w:bottom w:w="0" w:type="dxa"/>
-          </w:tblCellMar>
-        </w:tblPrEx>
         <w:tc>
           <w:tcPr>
             <w:tcW w:w="8226" w:type="dxa"/>
@@ -425,12 +413,6 @@
         </w:tc>
       </w:tr>
       <w:tr>
-        <w:tblPrEx>
-          <w:tblCellMar>
-            <w:top w:w="0" w:type="dxa"/>
-            <w:bottom w:w="0" w:type="dxa"/>
-          </w:tblCellMar>
-        </w:tblPrEx>
         <w:tc>
           <w:tcPr>
             <w:tcW w:w="8226" w:type="dxa"/>
@@ -472,12 +454,6 @@
         </w:tc>
       </w:tr>
       <w:tr>
-        <w:tblPrEx>
-          <w:tblCellMar>
-            <w:top w:w="0" w:type="dxa"/>
-            <w:bottom w:w="0" w:type="dxa"/>
-          </w:tblCellMar>
-        </w:tblPrEx>
         <w:tc>
           <w:tcPr>
             <w:tcW w:w="8226" w:type="dxa"/>
@@ -519,12 +495,6 @@
         </w:tc>
       </w:tr>
       <w:tr>
-        <w:tblPrEx>
-          <w:tblCellMar>
-            <w:top w:w="0" w:type="dxa"/>
-            <w:bottom w:w="0" w:type="dxa"/>
-          </w:tblCellMar>
-        </w:tblPrEx>
         <w:tc>
           <w:tcPr>
             <w:tcW w:w="8226" w:type="dxa"/>
@@ -566,12 +536,6 @@
         </w:tc>
       </w:tr>
       <w:tr>
-        <w:tblPrEx>
-          <w:tblCellMar>
-            <w:top w:w="0" w:type="dxa"/>
-            <w:bottom w:w="0" w:type="dxa"/>
-          </w:tblCellMar>
-        </w:tblPrEx>
         <w:tc>
           <w:tcPr>
             <w:tcW w:w="8226" w:type="dxa"/>
@@ -613,12 +577,6 @@
         </w:tc>
       </w:tr>
       <w:tr>
-        <w:tblPrEx>
-          <w:tblCellMar>
-            <w:top w:w="0" w:type="dxa"/>
-            <w:bottom w:w="0" w:type="dxa"/>
-          </w:tblCellMar>
-        </w:tblPrEx>
         <w:tc>
           <w:tcPr>
             <w:tcW w:w="8226" w:type="dxa"/>
@@ -660,12 +618,6 @@
         </w:tc>
       </w:tr>
       <w:tr>
-        <w:tblPrEx>
-          <w:tblCellMar>
-            <w:top w:w="0" w:type="dxa"/>
-            <w:bottom w:w="0" w:type="dxa"/>
-          </w:tblCellMar>
-        </w:tblPrEx>
         <w:tc>
           <w:tcPr>
             <w:tcW w:w="8226" w:type="dxa"/>
@@ -707,12 +659,6 @@
         </w:tc>
       </w:tr>
       <w:tr>
-        <w:tblPrEx>
-          <w:tblCellMar>
-            <w:top w:w="0" w:type="dxa"/>
-            <w:bottom w:w="0" w:type="dxa"/>
-          </w:tblCellMar>
-        </w:tblPrEx>
         <w:tc>
           <w:tcPr>
             <w:tcW w:w="8226" w:type="dxa"/>
@@ -754,12 +700,6 @@
         </w:tc>
       </w:tr>
       <w:tr>
-        <w:tblPrEx>
-          <w:tblCellMar>
-            <w:top w:w="0" w:type="dxa"/>
-            <w:bottom w:w="0" w:type="dxa"/>
-          </w:tblCellMar>
-        </w:tblPrEx>
         <w:tc>
           <w:tcPr>
             <w:tcW w:w="8226" w:type="dxa"/>
@@ -801,12 +741,6 @@
         </w:tc>
       </w:tr>
       <w:tr>
-        <w:tblPrEx>
-          <w:tblCellMar>
-            <w:top w:w="0" w:type="dxa"/>
-            <w:bottom w:w="0" w:type="dxa"/>
-          </w:tblCellMar>
-        </w:tblPrEx>
         <w:tc>
           <w:tcPr>
             <w:tcW w:w="8226" w:type="dxa"/>
@@ -848,12 +782,6 @@
         </w:tc>
       </w:tr>
       <w:tr>
-        <w:tblPrEx>
-          <w:tblCellMar>
-            <w:top w:w="0" w:type="dxa"/>
-            <w:bottom w:w="0" w:type="dxa"/>
-          </w:tblCellMar>
-        </w:tblPrEx>
         <w:tc>
           <w:tcPr>
             <w:tcW w:w="8226" w:type="dxa"/>
@@ -895,12 +823,6 @@
         </w:tc>
       </w:tr>
       <w:tr>
-        <w:tblPrEx>
-          <w:tblCellMar>
-            <w:top w:w="0" w:type="dxa"/>
-            <w:bottom w:w="0" w:type="dxa"/>
-          </w:tblCellMar>
-        </w:tblPrEx>
         <w:tc>
           <w:tcPr>
             <w:tcW w:w="8226" w:type="dxa"/>
@@ -942,12 +864,6 @@
         </w:tc>
       </w:tr>
       <w:tr>
-        <w:tblPrEx>
-          <w:tblCellMar>
-            <w:top w:w="0" w:type="dxa"/>
-            <w:bottom w:w="0" w:type="dxa"/>
-          </w:tblCellMar>
-        </w:tblPrEx>
         <w:tc>
           <w:tcPr>
             <w:tcW w:w="8226" w:type="dxa"/>
@@ -989,12 +905,6 @@
         </w:tc>
       </w:tr>
       <w:tr>
-        <w:tblPrEx>
-          <w:tblCellMar>
-            <w:top w:w="0" w:type="dxa"/>
-            <w:bottom w:w="0" w:type="dxa"/>
-          </w:tblCellMar>
-        </w:tblPrEx>
         <w:tc>
           <w:tcPr>
             <w:tcW w:w="8226" w:type="dxa"/>
@@ -1036,12 +946,6 @@
         </w:tc>
       </w:tr>
       <w:tr>
-        <w:tblPrEx>
-          <w:tblCellMar>
-            <w:top w:w="0" w:type="dxa"/>
-            <w:bottom w:w="0" w:type="dxa"/>
-          </w:tblCellMar>
-        </w:tblPrEx>
         <w:tc>
           <w:tcPr>
             <w:tcW w:w="8226" w:type="dxa"/>
@@ -1083,12 +987,6 @@
         </w:tc>
       </w:tr>
       <w:tr>
-        <w:tblPrEx>
-          <w:tblCellMar>
-            <w:top w:w="0" w:type="dxa"/>
-            <w:bottom w:w="0" w:type="dxa"/>
-          </w:tblCellMar>
-        </w:tblPrEx>
         <w:tc>
           <w:tcPr>
             <w:tcW w:w="8226" w:type="dxa"/>
@@ -1130,12 +1028,6 @@
         </w:tc>
       </w:tr>
       <w:tr>
-        <w:tblPrEx>
-          <w:tblCellMar>
-            <w:top w:w="0" w:type="dxa"/>
-            <w:bottom w:w="0" w:type="dxa"/>
-          </w:tblCellMar>
-        </w:tblPrEx>
         <w:tc>
           <w:tcPr>
             <w:tcW w:w="8226" w:type="dxa"/>
@@ -1177,12 +1069,6 @@
         </w:tc>
       </w:tr>
       <w:tr>
-        <w:tblPrEx>
-          <w:tblCellMar>
-            <w:top w:w="0" w:type="dxa"/>
-            <w:bottom w:w="0" w:type="dxa"/>
-          </w:tblCellMar>
-        </w:tblPrEx>
         <w:tc>
           <w:tcPr>
             <w:tcW w:w="8226" w:type="dxa"/>
@@ -1224,12 +1110,6 @@
         </w:tc>
       </w:tr>
       <w:tr>
-        <w:tblPrEx>
-          <w:tblCellMar>
-            <w:top w:w="0" w:type="dxa"/>
-            <w:bottom w:w="0" w:type="dxa"/>
-          </w:tblCellMar>
-        </w:tblPrEx>
         <w:tc>
           <w:tcPr>
             <w:tcW w:w="8226" w:type="dxa"/>
@@ -1271,12 +1151,6 @@
         </w:tc>
       </w:tr>
       <w:tr>
-        <w:tblPrEx>
-          <w:tblCellMar>
-            <w:top w:w="0" w:type="dxa"/>
-            <w:bottom w:w="0" w:type="dxa"/>
-          </w:tblCellMar>
-        </w:tblPrEx>
         <w:tc>
           <w:tcPr>
             <w:tcW w:w="8226" w:type="dxa"/>
@@ -1569,12 +1443,6 @@
         <w:gridCol w:w="5226"/>
       </w:tblGrid>
       <w:tr>
-        <w:tblPrEx>
-          <w:tblCellMar>
-            <w:top w:w="0" w:type="dxa"/>
-            <w:bottom w:w="0" w:type="dxa"/>
-          </w:tblCellMar>
-        </w:tblPrEx>
         <w:trPr>
           <w:tblHeader/>
         </w:trPr>
@@ -1658,12 +1526,6 @@
         </w:tc>
       </w:tr>
       <w:tr>
-        <w:tblPrEx>
-          <w:tblCellMar>
-            <w:top w:w="0" w:type="dxa"/>
-            <w:bottom w:w="0" w:type="dxa"/>
-          </w:tblCellMar>
-        </w:tblPrEx>
         <w:tc>
           <w:tcPr>
             <w:tcW w:w="2100" w:type="dxa"/>
@@ -1735,12 +1597,6 @@
         </w:tc>
       </w:tr>
       <w:tr>
-        <w:tblPrEx>
-          <w:tblCellMar>
-            <w:top w:w="0" w:type="dxa"/>
-            <w:bottom w:w="0" w:type="dxa"/>
-          </w:tblCellMar>
-        </w:tblPrEx>
         <w:tc>
           <w:tcPr>
             <w:tcW w:w="2100" w:type="dxa"/>
@@ -1815,12 +1671,6 @@
         </w:tc>
       </w:tr>
       <w:tr>
-        <w:tblPrEx>
-          <w:tblCellMar>
-            <w:top w:w="0" w:type="dxa"/>
-            <w:bottom w:w="0" w:type="dxa"/>
-          </w:tblCellMar>
-        </w:tblPrEx>
         <w:tc>
           <w:tcPr>
             <w:tcW w:w="2100" w:type="dxa"/>
@@ -1892,12 +1742,6 @@
         </w:tc>
       </w:tr>
       <w:tr>
-        <w:tblPrEx>
-          <w:tblCellMar>
-            <w:top w:w="0" w:type="dxa"/>
-            <w:bottom w:w="0" w:type="dxa"/>
-          </w:tblCellMar>
-        </w:tblPrEx>
         <w:tc>
           <w:tcPr>
             <w:tcW w:w="2100" w:type="dxa"/>
@@ -1972,12 +1816,6 @@
         </w:tc>
       </w:tr>
       <w:tr>
-        <w:tblPrEx>
-          <w:tblCellMar>
-            <w:top w:w="0" w:type="dxa"/>
-            <w:bottom w:w="0" w:type="dxa"/>
-          </w:tblCellMar>
-        </w:tblPrEx>
         <w:tc>
           <w:tcPr>
             <w:tcW w:w="2100" w:type="dxa"/>
@@ -2049,12 +1887,6 @@
         </w:tc>
       </w:tr>
       <w:tr>
-        <w:tblPrEx>
-          <w:tblCellMar>
-            <w:top w:w="0" w:type="dxa"/>
-            <w:bottom w:w="0" w:type="dxa"/>
-          </w:tblCellMar>
-        </w:tblPrEx>
         <w:tc>
           <w:tcPr>
             <w:tcW w:w="2100" w:type="dxa"/>
@@ -2329,12 +2161,6 @@
         <w:gridCol w:w="5026"/>
       </w:tblGrid>
       <w:tr>
-        <w:tblPrEx>
-          <w:tblCellMar>
-            <w:top w:w="0" w:type="dxa"/>
-            <w:bottom w:w="0" w:type="dxa"/>
-          </w:tblCellMar>
-        </w:tblPrEx>
         <w:trPr>
           <w:tblHeader/>
         </w:trPr>
@@ -2418,12 +2244,6 @@
         </w:tc>
       </w:tr>
       <w:tr>
-        <w:tblPrEx>
-          <w:tblCellMar>
-            <w:top w:w="0" w:type="dxa"/>
-            <w:bottom w:w="0" w:type="dxa"/>
-          </w:tblCellMar>
-        </w:tblPrEx>
         <w:tc>
           <w:tcPr>
             <w:tcW w:w="1500" w:type="dxa"/>
@@ -2495,12 +2315,6 @@
         </w:tc>
       </w:tr>
       <w:tr>
-        <w:tblPrEx>
-          <w:tblCellMar>
-            <w:top w:w="0" w:type="dxa"/>
-            <w:bottom w:w="0" w:type="dxa"/>
-          </w:tblCellMar>
-        </w:tblPrEx>
         <w:tc>
           <w:tcPr>
             <w:tcW w:w="1500" w:type="dxa"/>
@@ -2575,12 +2389,6 @@
         </w:tc>
       </w:tr>
       <w:tr>
-        <w:tblPrEx>
-          <w:tblCellMar>
-            <w:top w:w="0" w:type="dxa"/>
-            <w:bottom w:w="0" w:type="dxa"/>
-          </w:tblCellMar>
-        </w:tblPrEx>
         <w:tc>
           <w:tcPr>
             <w:tcW w:w="1500" w:type="dxa"/>
@@ -2725,12 +2533,6 @@
         </w:tc>
       </w:tr>
       <w:tr>
-        <w:tblPrEx>
-          <w:tblCellMar>
-            <w:top w:w="0" w:type="dxa"/>
-            <w:bottom w:w="0" w:type="dxa"/>
-          </w:tblCellMar>
-        </w:tblPrEx>
         <w:tc>
           <w:tcPr>
             <w:tcW w:w="1500" w:type="dxa"/>
@@ -2807,12 +2609,6 @@
         </w:tc>
       </w:tr>
       <w:tr>
-        <w:tblPrEx>
-          <w:tblCellMar>
-            <w:top w:w="0" w:type="dxa"/>
-            <w:bottom w:w="0" w:type="dxa"/>
-          </w:tblCellMar>
-        </w:tblPrEx>
         <w:tc>
           <w:tcPr>
             <w:tcW w:w="1500" w:type="dxa"/>
@@ -2893,12 +2689,6 @@
         </w:tc>
       </w:tr>
       <w:tr>
-        <w:tblPrEx>
-          <w:tblCellMar>
-            <w:top w:w="0" w:type="dxa"/>
-            <w:bottom w:w="0" w:type="dxa"/>
-          </w:tblCellMar>
-        </w:tblPrEx>
         <w:tc>
           <w:tcPr>
             <w:tcW w:w="1500" w:type="dxa"/>
@@ -2982,12 +2772,6 @@
         </w:tc>
       </w:tr>
       <w:tr>
-        <w:tblPrEx>
-          <w:tblCellMar>
-            <w:top w:w="0" w:type="dxa"/>
-            <w:bottom w:w="0" w:type="dxa"/>
-          </w:tblCellMar>
-        </w:tblPrEx>
         <w:tc>
           <w:tcPr>
             <w:tcW w:w="1500" w:type="dxa"/>
@@ -3068,12 +2852,6 @@
         </w:tc>
       </w:tr>
       <w:tr>
-        <w:tblPrEx>
-          <w:tblCellMar>
-            <w:top w:w="0" w:type="dxa"/>
-            <w:bottom w:w="0" w:type="dxa"/>
-          </w:tblCellMar>
-        </w:tblPrEx>
         <w:tc>
           <w:tcPr>
             <w:tcW w:w="1500" w:type="dxa"/>
@@ -3150,12 +2928,6 @@
         </w:tc>
       </w:tr>
       <w:tr>
-        <w:tblPrEx>
-          <w:tblCellMar>
-            <w:top w:w="0" w:type="dxa"/>
-            <w:bottom w:w="0" w:type="dxa"/>
-          </w:tblCellMar>
-        </w:tblPrEx>
         <w:tc>
           <w:tcPr>
             <w:tcW w:w="1500" w:type="dxa"/>
@@ -3357,12 +3129,6 @@
         <w:gridCol w:w="3869"/>
       </w:tblGrid>
       <w:tr>
-        <w:tblPrEx>
-          <w:tblCellMar>
-            <w:top w:w="0" w:type="dxa"/>
-            <w:bottom w:w="0" w:type="dxa"/>
-          </w:tblCellMar>
-        </w:tblPrEx>
         <w:trPr>
           <w:tblHeader/>
         </w:trPr>
@@ -3446,12 +3212,6 @@
         </w:tc>
       </w:tr>
       <w:tr>
-        <w:tblPrEx>
-          <w:tblCellMar>
-            <w:top w:w="0" w:type="dxa"/>
-            <w:bottom w:w="0" w:type="dxa"/>
-          </w:tblCellMar>
-        </w:tblPrEx>
         <w:tc>
           <w:tcPr>
             <w:tcW w:w="2000" w:type="dxa"/>
@@ -3533,12 +3293,6 @@
         </w:tc>
       </w:tr>
       <w:tr>
-        <w:tblPrEx>
-          <w:tblCellMar>
-            <w:top w:w="0" w:type="dxa"/>
-            <w:bottom w:w="0" w:type="dxa"/>
-          </w:tblCellMar>
-        </w:tblPrEx>
         <w:tc>
           <w:tcPr>
             <w:tcW w:w="2000" w:type="dxa"/>
@@ -3614,12 +3368,6 @@
         </w:tc>
       </w:tr>
       <w:tr>
-        <w:tblPrEx>
-          <w:tblCellMar>
-            <w:top w:w="0" w:type="dxa"/>
-            <w:bottom w:w="0" w:type="dxa"/>
-          </w:tblCellMar>
-        </w:tblPrEx>
         <w:tc>
           <w:tcPr>
             <w:tcW w:w="2000" w:type="dxa"/>
@@ -3726,12 +3474,6 @@
         </w:tc>
       </w:tr>
       <w:tr>
-        <w:tblPrEx>
-          <w:tblCellMar>
-            <w:top w:w="0" w:type="dxa"/>
-            <w:bottom w:w="0" w:type="dxa"/>
-          </w:tblCellMar>
-        </w:tblPrEx>
         <w:tc>
           <w:tcPr>
             <w:tcW w:w="2000" w:type="dxa"/>
@@ -3864,12 +3606,6 @@
         </w:tc>
       </w:tr>
       <w:tr>
-        <w:tblPrEx>
-          <w:tblCellMar>
-            <w:top w:w="0" w:type="dxa"/>
-            <w:bottom w:w="0" w:type="dxa"/>
-          </w:tblCellMar>
-        </w:tblPrEx>
         <w:tc>
           <w:tcPr>
             <w:tcW w:w="2000" w:type="dxa"/>
@@ -3974,12 +3710,6 @@
         </w:tc>
       </w:tr>
       <w:tr>
-        <w:tblPrEx>
-          <w:tblCellMar>
-            <w:top w:w="0" w:type="dxa"/>
-            <w:bottom w:w="0" w:type="dxa"/>
-          </w:tblCellMar>
-        </w:tblPrEx>
         <w:tc>
           <w:tcPr>
             <w:tcW w:w="2000" w:type="dxa"/>
@@ -4096,12 +3826,6 @@
         </w:tc>
       </w:tr>
       <w:tr>
-        <w:tblPrEx>
-          <w:tblCellMar>
-            <w:top w:w="0" w:type="dxa"/>
-            <w:bottom w:w="0" w:type="dxa"/>
-          </w:tblCellMar>
-        </w:tblPrEx>
         <w:tc>
           <w:tcPr>
             <w:tcW w:w="2000" w:type="dxa"/>
@@ -5436,12 +5160,6 @@
         <w:gridCol w:w="4410"/>
       </w:tblGrid>
       <w:tr>
-        <w:tblPrEx>
-          <w:tblCellMar>
-            <w:top w:w="0" w:type="dxa"/>
-            <w:bottom w:w="0" w:type="dxa"/>
-          </w:tblCellMar>
-        </w:tblPrEx>
         <w:trPr>
           <w:tblHeader/>
         </w:trPr>
@@ -5525,12 +5243,6 @@
         </w:tc>
       </w:tr>
       <w:tr>
-        <w:tblPrEx>
-          <w:tblCellMar>
-            <w:top w:w="0" w:type="dxa"/>
-            <w:bottom w:w="0" w:type="dxa"/>
-          </w:tblCellMar>
-        </w:tblPrEx>
         <w:tc>
           <w:tcPr>
             <w:tcW w:w="2700" w:type="dxa"/>
@@ -5604,12 +5316,6 @@
         </w:tc>
       </w:tr>
       <w:tr>
-        <w:tblPrEx>
-          <w:tblCellMar>
-            <w:top w:w="0" w:type="dxa"/>
-            <w:bottom w:w="0" w:type="dxa"/>
-          </w:tblCellMar>
-        </w:tblPrEx>
         <w:tc>
           <w:tcPr>
             <w:tcW w:w="2700" w:type="dxa"/>
@@ -5684,12 +5390,6 @@
         </w:tc>
       </w:tr>
       <w:tr>
-        <w:tblPrEx>
-          <w:tblCellMar>
-            <w:top w:w="0" w:type="dxa"/>
-            <w:bottom w:w="0" w:type="dxa"/>
-          </w:tblCellMar>
-        </w:tblPrEx>
         <w:tc>
           <w:tcPr>
             <w:tcW w:w="2700" w:type="dxa"/>
@@ -5763,12 +5463,6 @@
         </w:tc>
       </w:tr>
       <w:tr>
-        <w:tblPrEx>
-          <w:tblCellMar>
-            <w:top w:w="0" w:type="dxa"/>
-            <w:bottom w:w="0" w:type="dxa"/>
-          </w:tblCellMar>
-        </w:tblPrEx>
         <w:tc>
           <w:tcPr>
             <w:tcW w:w="2700" w:type="dxa"/>
@@ -5845,12 +5539,6 @@
         </w:tc>
       </w:tr>
       <w:tr>
-        <w:tblPrEx>
-          <w:tblCellMar>
-            <w:top w:w="0" w:type="dxa"/>
-            <w:bottom w:w="0" w:type="dxa"/>
-          </w:tblCellMar>
-        </w:tblPrEx>
         <w:tc>
           <w:tcPr>
             <w:tcW w:w="2700" w:type="dxa"/>
@@ -5924,12 +5612,6 @@
         </w:tc>
       </w:tr>
       <w:tr>
-        <w:tblPrEx>
-          <w:tblCellMar>
-            <w:top w:w="0" w:type="dxa"/>
-            <w:bottom w:w="0" w:type="dxa"/>
-          </w:tblCellMar>
-        </w:tblPrEx>
         <w:tc>
           <w:tcPr>
             <w:tcW w:w="2700" w:type="dxa"/>
@@ -6006,12 +5688,6 @@
         </w:tc>
       </w:tr>
       <w:tr>
-        <w:tblPrEx>
-          <w:tblCellMar>
-            <w:top w:w="0" w:type="dxa"/>
-            <w:bottom w:w="0" w:type="dxa"/>
-          </w:tblCellMar>
-        </w:tblPrEx>
         <w:tc>
           <w:tcPr>
             <w:tcW w:w="2700" w:type="dxa"/>
@@ -6085,12 +5761,6 @@
         </w:tc>
       </w:tr>
       <w:tr>
-        <w:tblPrEx>
-          <w:tblCellMar>
-            <w:top w:w="0" w:type="dxa"/>
-            <w:bottom w:w="0" w:type="dxa"/>
-          </w:tblCellMar>
-        </w:tblPrEx>
         <w:tc>
           <w:tcPr>
             <w:tcW w:w="2700" w:type="dxa"/>
@@ -6167,12 +5837,6 @@
         </w:tc>
       </w:tr>
       <w:tr>
-        <w:tblPrEx>
-          <w:tblCellMar>
-            <w:top w:w="0" w:type="dxa"/>
-            <w:bottom w:w="0" w:type="dxa"/>
-          </w:tblCellMar>
-        </w:tblPrEx>
         <w:tc>
           <w:tcPr>
             <w:tcW w:w="2700" w:type="dxa"/>
@@ -6246,12 +5910,6 @@
         </w:tc>
       </w:tr>
       <w:tr>
-        <w:tblPrEx>
-          <w:tblCellMar>
-            <w:top w:w="0" w:type="dxa"/>
-            <w:bottom w:w="0" w:type="dxa"/>
-          </w:tblCellMar>
-        </w:tblPrEx>
         <w:tc>
           <w:tcPr>
             <w:tcW w:w="2700" w:type="dxa"/>
@@ -6328,12 +5986,6 @@
         </w:tc>
       </w:tr>
       <w:tr>
-        <w:tblPrEx>
-          <w:tblCellMar>
-            <w:top w:w="0" w:type="dxa"/>
-            <w:bottom w:w="0" w:type="dxa"/>
-          </w:tblCellMar>
-        </w:tblPrEx>
         <w:tc>
           <w:tcPr>
             <w:tcW w:w="2700" w:type="dxa"/>
@@ -6407,12 +6059,6 @@
         </w:tc>
       </w:tr>
       <w:tr>
-        <w:tblPrEx>
-          <w:tblCellMar>
-            <w:top w:w="0" w:type="dxa"/>
-            <w:bottom w:w="0" w:type="dxa"/>
-          </w:tblCellMar>
-        </w:tblPrEx>
         <w:tc>
           <w:tcPr>
             <w:tcW w:w="2700" w:type="dxa"/>
@@ -6562,12 +6208,6 @@
         <w:gridCol w:w="4126"/>
       </w:tblGrid>
       <w:tr>
-        <w:tblPrEx>
-          <w:tblCellMar>
-            <w:top w:w="0" w:type="dxa"/>
-            <w:bottom w:w="0" w:type="dxa"/>
-          </w:tblCellMar>
-        </w:tblPrEx>
         <w:trPr>
           <w:tblHeader/>
         </w:trPr>
@@ -6651,12 +6291,6 @@
         </w:tc>
       </w:tr>
       <w:tr>
-        <w:tblPrEx>
-          <w:tblCellMar>
-            <w:top w:w="0" w:type="dxa"/>
-            <w:bottom w:w="0" w:type="dxa"/>
-          </w:tblCellMar>
-        </w:tblPrEx>
         <w:tc>
           <w:tcPr>
             <w:tcW w:w="1800" w:type="dxa"/>
@@ -6778,12 +6412,6 @@
         </w:tc>
       </w:tr>
       <w:tr>
-        <w:tblPrEx>
-          <w:tblCellMar>
-            <w:top w:w="0" w:type="dxa"/>
-            <w:bottom w:w="0" w:type="dxa"/>
-          </w:tblCellMar>
-        </w:tblPrEx>
         <w:tc>
           <w:tcPr>
             <w:tcW w:w="1800" w:type="dxa"/>
@@ -7287,12 +6915,6 @@
         <w:gridCol w:w="7326"/>
       </w:tblGrid>
       <w:tr>
-        <w:tblPrEx>
-          <w:tblCellMar>
-            <w:top w:w="0" w:type="dxa"/>
-            <w:bottom w:w="0" w:type="dxa"/>
-          </w:tblCellMar>
-        </w:tblPrEx>
         <w:trPr>
           <w:tblHeader/>
         </w:trPr>
@@ -7351,12 +6973,6 @@
         </w:tc>
       </w:tr>
       <w:tr>
-        <w:tblPrEx>
-          <w:tblCellMar>
-            <w:top w:w="0" w:type="dxa"/>
-            <w:bottom w:w="0" w:type="dxa"/>
-          </w:tblCellMar>
-        </w:tblPrEx>
         <w:tc>
           <w:tcPr>
             <w:tcW w:w="1700" w:type="dxa"/>
@@ -7453,12 +7069,6 @@
         </w:tc>
       </w:tr>
       <w:tr>
-        <w:tblPrEx>
-          <w:tblCellMar>
-            <w:top w:w="0" w:type="dxa"/>
-            <w:bottom w:w="0" w:type="dxa"/>
-          </w:tblCellMar>
-        </w:tblPrEx>
         <w:tc>
           <w:tcPr>
             <w:tcW w:w="1700" w:type="dxa"/>
@@ -7509,12 +7119,6 @@
         </w:tc>
       </w:tr>
       <w:tr>
-        <w:tblPrEx>
-          <w:tblCellMar>
-            <w:top w:w="0" w:type="dxa"/>
-            <w:bottom w:w="0" w:type="dxa"/>
-          </w:tblCellMar>
-        </w:tblPrEx>
         <w:tc>
           <w:tcPr>
             <w:tcW w:w="1700" w:type="dxa"/>
@@ -8730,12 +8334,6 @@
         <w:gridCol w:w="4562"/>
       </w:tblGrid>
       <w:tr>
-        <w:tblPrEx>
-          <w:tblCellMar>
-            <w:top w:w="0" w:type="dxa"/>
-            <w:bottom w:w="0" w:type="dxa"/>
-          </w:tblCellMar>
-        </w:tblPrEx>
         <w:trPr>
           <w:tblHeader/>
         </w:trPr>
@@ -8819,12 +8417,6 @@
         </w:tc>
       </w:tr>
       <w:tr>
-        <w:tblPrEx>
-          <w:tblCellMar>
-            <w:top w:w="0" w:type="dxa"/>
-            <w:bottom w:w="0" w:type="dxa"/>
-          </w:tblCellMar>
-        </w:tblPrEx>
         <w:tc>
           <w:tcPr>
             <w:tcW w:w="1500" w:type="dxa"/>
@@ -8953,12 +8545,6 @@
         </w:tc>
       </w:tr>
       <w:tr>
-        <w:tblPrEx>
-          <w:tblCellMar>
-            <w:top w:w="0" w:type="dxa"/>
-            <w:bottom w:w="0" w:type="dxa"/>
-          </w:tblCellMar>
-        </w:tblPrEx>
         <w:tc>
           <w:tcPr>
             <w:tcW w:w="1500" w:type="dxa"/>
@@ -9106,12 +8692,6 @@
         </w:tc>
       </w:tr>
       <w:tr>
-        <w:tblPrEx>
-          <w:tblCellMar>
-            <w:top w:w="0" w:type="dxa"/>
-            <w:bottom w:w="0" w:type="dxa"/>
-          </w:tblCellMar>
-        </w:tblPrEx>
         <w:tc>
           <w:tcPr>
             <w:tcW w:w="1500" w:type="dxa"/>
@@ -9183,12 +8763,6 @@
         </w:tc>
       </w:tr>
       <w:tr>
-        <w:tblPrEx>
-          <w:tblCellMar>
-            <w:top w:w="0" w:type="dxa"/>
-            <w:bottom w:w="0" w:type="dxa"/>
-          </w:tblCellMar>
-        </w:tblPrEx>
         <w:tc>
           <w:tcPr>
             <w:tcW w:w="1500" w:type="dxa"/>
@@ -9630,12 +9204,6 @@
         <w:gridCol w:w="6726"/>
       </w:tblGrid>
       <w:tr>
-        <w:tblPrEx>
-          <w:tblCellMar>
-            <w:top w:w="0" w:type="dxa"/>
-            <w:bottom w:w="0" w:type="dxa"/>
-          </w:tblCellMar>
-        </w:tblPrEx>
         <w:trPr>
           <w:tblHeader/>
         </w:trPr>
@@ -9693,12 +9261,6 @@
         </w:tc>
       </w:tr>
       <w:tr>
-        <w:tblPrEx>
-          <w:tblCellMar>
-            <w:top w:w="0" w:type="dxa"/>
-            <w:bottom w:w="0" w:type="dxa"/>
-          </w:tblCellMar>
-        </w:tblPrEx>
         <w:tc>
           <w:tcPr>
             <w:tcW w:w="2300" w:type="dxa"/>
@@ -9756,12 +9318,6 @@
         </w:tc>
       </w:tr>
       <w:tr>
-        <w:tblPrEx>
-          <w:tblCellMar>
-            <w:top w:w="0" w:type="dxa"/>
-            <w:bottom w:w="0" w:type="dxa"/>
-          </w:tblCellMar>
-        </w:tblPrEx>
         <w:tc>
           <w:tcPr>
             <w:tcW w:w="2300" w:type="dxa"/>
@@ -9830,12 +9386,6 @@
         </w:tc>
       </w:tr>
       <w:tr>
-        <w:tblPrEx>
-          <w:tblCellMar>
-            <w:top w:w="0" w:type="dxa"/>
-            <w:bottom w:w="0" w:type="dxa"/>
-          </w:tblCellMar>
-        </w:tblPrEx>
         <w:tc>
           <w:tcPr>
             <w:tcW w:w="2300" w:type="dxa"/>
@@ -9934,12 +9484,6 @@
         </w:tc>
       </w:tr>
       <w:tr>
-        <w:tblPrEx>
-          <w:tblCellMar>
-            <w:top w:w="0" w:type="dxa"/>
-            <w:bottom w:w="0" w:type="dxa"/>
-          </w:tblCellMar>
-        </w:tblPrEx>
         <w:tc>
           <w:tcPr>
             <w:tcW w:w="2300" w:type="dxa"/>
@@ -10024,12 +9568,6 @@
         </w:tc>
       </w:tr>
       <w:tr>
-        <w:tblPrEx>
-          <w:tblCellMar>
-            <w:top w:w="0" w:type="dxa"/>
-            <w:bottom w:w="0" w:type="dxa"/>
-          </w:tblCellMar>
-        </w:tblPrEx>
         <w:tc>
           <w:tcPr>
             <w:tcW w:w="2300" w:type="dxa"/>
@@ -10096,12 +9634,6 @@
         </w:tc>
       </w:tr>
       <w:tr>
-        <w:tblPrEx>
-          <w:tblCellMar>
-            <w:top w:w="0" w:type="dxa"/>
-            <w:bottom w:w="0" w:type="dxa"/>
-          </w:tblCellMar>
-        </w:tblPrEx>
         <w:tc>
           <w:tcPr>
             <w:tcW w:w="2300" w:type="dxa"/>
@@ -10243,12 +9775,6 @@
         <w:gridCol w:w="6126"/>
       </w:tblGrid>
       <w:tr>
-        <w:tblPrEx>
-          <w:tblCellMar>
-            <w:top w:w="0" w:type="dxa"/>
-            <w:bottom w:w="0" w:type="dxa"/>
-          </w:tblCellMar>
-        </w:tblPrEx>
         <w:trPr>
           <w:tblHeader/>
         </w:trPr>
@@ -10332,12 +9858,6 @@
         </w:tc>
       </w:tr>
       <w:tr>
-        <w:tblPrEx>
-          <w:tblCellMar>
-            <w:top w:w="0" w:type="dxa"/>
-            <w:bottom w:w="0" w:type="dxa"/>
-          </w:tblCellMar>
-        </w:tblPrEx>
         <w:tc>
           <w:tcPr>
             <w:tcW w:w="2000" w:type="dxa"/>
@@ -10409,12 +9929,6 @@
         </w:tc>
       </w:tr>
       <w:tr>
-        <w:tblPrEx>
-          <w:tblCellMar>
-            <w:top w:w="0" w:type="dxa"/>
-            <w:bottom w:w="0" w:type="dxa"/>
-          </w:tblCellMar>
-        </w:tblPrEx>
         <w:tc>
           <w:tcPr>
             <w:tcW w:w="2000" w:type="dxa"/>
@@ -10489,12 +10003,6 @@
         </w:tc>
       </w:tr>
       <w:tr>
-        <w:tblPrEx>
-          <w:tblCellMar>
-            <w:top w:w="0" w:type="dxa"/>
-            <w:bottom w:w="0" w:type="dxa"/>
-          </w:tblCellMar>
-        </w:tblPrEx>
         <w:tc>
           <w:tcPr>
             <w:tcW w:w="2000" w:type="dxa"/>
@@ -10575,12 +10083,6 @@
         </w:tc>
       </w:tr>
       <w:tr>
-        <w:tblPrEx>
-          <w:tblCellMar>
-            <w:top w:w="0" w:type="dxa"/>
-            <w:bottom w:w="0" w:type="dxa"/>
-          </w:tblCellMar>
-        </w:tblPrEx>
         <w:tc>
           <w:tcPr>
             <w:tcW w:w="2000" w:type="dxa"/>
@@ -11298,19 +10800,6 @@
     </w:p>
     <w:p>
       <w:pPr>
-        <w:spacing w:after="120" w:line="300" w:lineRule="auto"/>
-      </w:pPr>
-      <w:r>
-        <w:rPr>
-          <w:i/>
-          <w:iCs/>
-          <w:color w:val="B03030"/>
-        </w:rPr>
-        <w:t>The values above are representative of the system's behaviour on the sample corpus; exact wording, timings and token counts vary between runs. Replace this section with a screenshot of your own run before submission.</w:t>
-      </w:r>
-    </w:p>
-    <w:p>
-      <w:pPr>
         <w:pStyle w:val="Heading2"/>
         <w:spacing w:before="260" w:after="120"/>
       </w:pPr>
@@ -11351,7 +10840,6 @@
         <w:spacing w:after="80" w:line="300" w:lineRule="auto"/>
       </w:pPr>
       <w:r>
-        <w:lastRenderedPageBreak/>
         <w:t>Escalation is identified from the meaning of the text, not from a keyword: complaint_005 mentions a manager but records the case as resolved, whereas complaint_002 describes a third unanswered contact and an ombudsman.</w:t>
       </w:r>
     </w:p>
@@ -11378,6 +10866,7 @@
         <w:spacing w:after="80" w:line="300" w:lineRule="auto"/>
       </w:pPr>
       <w:r>
+        <w:lastRenderedPageBreak/>
         <w:t>The unsupported .csv file is skipped silently, as intended, and does not appear in the report.</w:t>
       </w:r>
     </w:p>
@@ -11423,12 +10912,6 @@
         <w:gridCol w:w="6626"/>
       </w:tblGrid>
       <w:tr>
-        <w:tblPrEx>
-          <w:tblCellMar>
-            <w:top w:w="0" w:type="dxa"/>
-            <w:bottom w:w="0" w:type="dxa"/>
-          </w:tblCellMar>
-        </w:tblPrEx>
         <w:trPr>
           <w:tblHeader/>
         </w:trPr>
@@ -11486,12 +10969,6 @@
         </w:tc>
       </w:tr>
       <w:tr>
-        <w:tblPrEx>
-          <w:tblCellMar>
-            <w:top w:w="0" w:type="dxa"/>
-            <w:bottom w:w="0" w:type="dxa"/>
-          </w:tblCellMar>
-        </w:tblPrEx>
         <w:tc>
           <w:tcPr>
             <w:tcW w:w="2400" w:type="dxa"/>
@@ -11565,12 +11042,6 @@
         </w:tc>
       </w:tr>
       <w:tr>
-        <w:tblPrEx>
-          <w:tblCellMar>
-            <w:top w:w="0" w:type="dxa"/>
-            <w:bottom w:w="0" w:type="dxa"/>
-          </w:tblCellMar>
-        </w:tblPrEx>
         <w:tc>
           <w:tcPr>
             <w:tcW w:w="2400" w:type="dxa"/>
@@ -11687,12 +11158,6 @@
         </w:tc>
       </w:tr>
       <w:tr>
-        <w:tblPrEx>
-          <w:tblCellMar>
-            <w:top w:w="0" w:type="dxa"/>
-            <w:bottom w:w="0" w:type="dxa"/>
-          </w:tblCellMar>
-        </w:tblPrEx>
         <w:tc>
           <w:tcPr>
             <w:tcW w:w="2400" w:type="dxa"/>
@@ -11741,12 +11206,6 @@
         </w:tc>
       </w:tr>
       <w:tr>
-        <w:tblPrEx>
-          <w:tblCellMar>
-            <w:top w:w="0" w:type="dxa"/>
-            <w:bottom w:w="0" w:type="dxa"/>
-          </w:tblCellMar>
-        </w:tblPrEx>
         <w:tc>
           <w:tcPr>
             <w:tcW w:w="2400" w:type="dxa"/>
@@ -11829,12 +11288,6 @@
         </w:tc>
       </w:tr>
       <w:tr>
-        <w:tblPrEx>
-          <w:tblCellMar>
-            <w:top w:w="0" w:type="dxa"/>
-            <w:bottom w:w="0" w:type="dxa"/>
-          </w:tblCellMar>
-        </w:tblPrEx>
         <w:tc>
           <w:tcPr>
             <w:tcW w:w="2400" w:type="dxa"/>
@@ -11901,12 +11354,6 @@
         </w:tc>
       </w:tr>
       <w:tr>
-        <w:tblPrEx>
-          <w:tblCellMar>
-            <w:top w:w="0" w:type="dxa"/>
-            <w:bottom w:w="0" w:type="dxa"/>
-          </w:tblCellMar>
-        </w:tblPrEx>
         <w:tc>
           <w:tcPr>
             <w:tcW w:w="2400" w:type="dxa"/>
@@ -11957,12 +11404,6 @@
         </w:tc>
       </w:tr>
       <w:tr>
-        <w:tblPrEx>
-          <w:tblCellMar>
-            <w:top w:w="0" w:type="dxa"/>
-            <w:bottom w:w="0" w:type="dxa"/>
-          </w:tblCellMar>
-        </w:tblPrEx>
         <w:tc>
           <w:tcPr>
             <w:tcW w:w="2400" w:type="dxa"/>
@@ -12027,12 +11468,6 @@
         </w:tc>
       </w:tr>
       <w:tr>
-        <w:tblPrEx>
-          <w:tblCellMar>
-            <w:top w:w="0" w:type="dxa"/>
-            <w:bottom w:w="0" w:type="dxa"/>
-          </w:tblCellMar>
-        </w:tblPrEx>
         <w:tc>
           <w:tcPr>
             <w:tcW w:w="2400" w:type="dxa"/>
@@ -12099,12 +11534,6 @@
         </w:tc>
       </w:tr>
       <w:tr>
-        <w:tblPrEx>
-          <w:tblCellMar>
-            <w:top w:w="0" w:type="dxa"/>
-            <w:bottom w:w="0" w:type="dxa"/>
-          </w:tblCellMar>
-        </w:tblPrEx>
         <w:tc>
           <w:tcPr>
             <w:tcW w:w="2400" w:type="dxa"/>
@@ -12153,12 +11582,6 @@
         </w:tc>
       </w:tr>
       <w:tr>
-        <w:tblPrEx>
-          <w:tblCellMar>
-            <w:top w:w="0" w:type="dxa"/>
-            <w:bottom w:w="0" w:type="dxa"/>
-          </w:tblCellMar>
-        </w:tblPrEx>
         <w:tc>
           <w:tcPr>
             <w:tcW w:w="2400" w:type="dxa"/>
@@ -12209,12 +11632,6 @@
         </w:tc>
       </w:tr>
       <w:tr>
-        <w:tblPrEx>
-          <w:tblCellMar>
-            <w:top w:w="0" w:type="dxa"/>
-            <w:bottom w:w="0" w:type="dxa"/>
-          </w:tblCellMar>
-        </w:tblPrEx>
         <w:tc>
           <w:tcPr>
             <w:tcW w:w="2400" w:type="dxa"/>
@@ -12297,12 +11714,6 @@
         </w:tc>
       </w:tr>
       <w:tr>
-        <w:tblPrEx>
-          <w:tblCellMar>
-            <w:top w:w="0" w:type="dxa"/>
-            <w:bottom w:w="0" w:type="dxa"/>
-          </w:tblCellMar>
-        </w:tblPrEx>
         <w:tc>
           <w:tcPr>
             <w:tcW w:w="2400" w:type="dxa"/>
@@ -13371,35 +12782,23 @@
           <w:sz w:val="18"/>
           <w:szCs w:val="18"/>
         </w:rPr>
-        <w:t>├── README.md                   how to run it</w:t>
-      </w:r>
-    </w:p>
-    <w:p>
-      <w:pPr>
-        <w:shd w:val="clear" w:color="auto" w:fill="F2F4F7"/>
-        <w:ind w:left="200" w:right="200"/>
-      </w:pPr>
-      <w:r>
-        <w:rPr>
-          <w:rFonts w:ascii="Consolas" w:eastAsia="Consolas" w:hAnsi="Consolas" w:cs="Consolas"/>
-          <w:sz w:val="18"/>
-          <w:szCs w:val="18"/>
-        </w:rPr>
-        <w:t>├── HOW_TO_DEMO.md              a five-minute demonstration script</w:t>
-      </w:r>
-    </w:p>
-    <w:p>
-      <w:pPr>
-        <w:shd w:val="clear" w:color="auto" w:fill="F2F4F7"/>
-        <w:ind w:left="200" w:right="200"/>
-      </w:pPr>
-      <w:r>
-        <w:rPr>
-          <w:rFonts w:ascii="Consolas" w:eastAsia="Consolas" w:hAnsi="Consolas" w:cs="Consolas"/>
-          <w:sz w:val="18"/>
-          <w:szCs w:val="18"/>
-        </w:rPr>
-        <w:t>├── GIT_SETUP.md                step-by-step GitHub instructions</w:t>
+        <w:t>└──</w:t>
+      </w:r>
+      <w:r>
+        <w:rPr>
+          <w:rFonts w:ascii="Consolas" w:eastAsia="Consolas" w:hAnsi="Consolas" w:cs="Consolas"/>
+          <w:sz w:val="18"/>
+          <w:szCs w:val="18"/>
+        </w:rPr>
+        <w:t xml:space="preserve"> </w:t>
+      </w:r>
+      <w:r>
+        <w:rPr>
+          <w:rFonts w:ascii="Consolas" w:eastAsia="Consolas" w:hAnsi="Consolas" w:cs="Consolas"/>
+          <w:sz w:val="18"/>
+          <w:szCs w:val="18"/>
+        </w:rPr>
+        <w:t>README.md                   how to run it</w:t>
       </w:r>
     </w:p>
     <w:p>
@@ -13408,14 +12807,6 @@
         <w:spacing w:after="160"/>
         <w:ind w:left="200" w:right="200"/>
       </w:pPr>
-      <w:r>
-        <w:rPr>
-          <w:rFonts w:ascii="Consolas" w:eastAsia="Consolas" w:hAnsi="Consolas" w:cs="Consolas"/>
-          <w:sz w:val="18"/>
-          <w:szCs w:val="18"/>
-        </w:rPr>
-        <w:t>└── SKILLS_CHECKLIST.md         the twelve skills mapped to the code</w:t>
-      </w:r>
     </w:p>
     <w:p>
       <w:r>

</xml_diff>